<commit_message>
Complete UML declarations and update assignment report
</commit_message>
<xml_diff>
--- a/reports/home-theater-facade-report.docx
+++ b/reports/home-theater-facade-report.docx
@@ -786,14 +786,25 @@
     </w:p>
     <w:p>
       <w:pPr>
+        <w:spacing w:after="100"/>
+      </w:pPr>
+      <w:r>
+        <w:rPr>
+          <w:sz w:val="18"/>
+        </w:rPr>
+        <w:t>Diagram correction 20 October 2026. Java source baseline 1ea6a10 is unchanged.</w:t>
+      </w:r>
+    </w:p>
+    <w:p>
+      <w:pPr>
         <w:spacing w:after="40"/>
         <w:jc w:val="center"/>
       </w:pPr>
       <w:r>
         <w:drawing>
           <wp:inline xmlns:a="http://schemas.openxmlformats.org/drawingml/2006/main" xmlns:pic="http://schemas.openxmlformats.org/drawingml/2006/picture">
-            <wp:extent cx="8869680" cy="5117123"/>
-            <wp:docPr id="1" name="Picture 1" descr="UML class diagram: the client uses HomeTheaterFacade, which has directed associations to six independent device classes."/>
+            <wp:extent cx="13990320" cy="7626096"/>
+            <wp:docPr id="1" name="Picture 1" descr="Complete UML diagram of all eight application classes and the JUnit test class, including all declared fields, methods, constructor, visibility, types, static/final markers, multiplicities, and dependencies."/>
             <wp:cNvGraphicFramePr>
               <a:graphicFrameLocks noChangeAspect="1"/>
             </wp:cNvGraphicFramePr>
@@ -813,7 +824,7 @@
                   <pic:spPr>
                     <a:xfrm>
                       <a:off x="0" y="0"/>
-                      <a:ext cx="8869680" cy="5117123"/>
+                      <a:ext cx="13990320" cy="7626096"/>
                     </a:xfrm>
                     <a:prstGeom prst="rect"/>
                   </pic:spPr>
@@ -826,22 +837,28 @@
     </w:p>
     <w:p>
       <w:pPr>
-        <w:spacing w:after="80"/>
+        <w:spacing w:after="60"/>
       </w:pPr>
       <w:r>
-        <w:t>Figure 1. Principal fields and operations. The dashed arrow is a client dependency; solid arrows show the facade's device references. A plus sign means public and a minus sign means private.</w:t>
+        <w:rPr>
+          <w:sz w:val="18"/>
+        </w:rPr>
+        <w:t>Figure 1. Complete source declarations: 8 application classes and 1 test class, 21 fields, 66 methods, and 1 explicit constructor. A3 landscape preserves legibility. Public (+), private (-), package (~), final references ({readOnly}), static main (underlined), and one device of each type per facade are shown.</w:t>
       </w:r>
     </w:p>
     <w:p>
       <w:r>
-        <w:t>HomeTheaterDemo uses only the facade. The facade owns the session workflow and delegates device behavior. No subsystem has a back-reference to the facade, and no inheritance hierarchy is required.</w:t>
+        <w:rPr>
+          <w:sz w:val="18"/>
+        </w:rPr>
+        <w:t>The dashed arrows show client and test dependencies; solid arrows show stored device references. HomeTheaterTest has package visibility. Method parameters appear in signatures. All local declarations are listed in Appendix A. External Java/JUnit types and implicit constructors are outside the authored-class count.</w:t>
       </w:r>
     </w:p>
     <w:p>
       <w:pPr>
         <w:sectPr>
-          <w:pgSz w:w="16834" w:h="11909" w:orient="landscape"/>
-          <w:pgMar w:top="792" w:right="936" w:bottom="792" w:left="936" w:header="720" w:footer="720" w:gutter="0"/>
+          <w:pgSz w:w="23818" w:h="16834" w:orient="landscape"/>
+          <w:pgMar w:top="720" w:right="792" w:bottom="720" w:left="792" w:header="720" w:footer="720" w:gutter="0"/>
           <w:cols w:space="720"/>
           <w:docGrid w:linePitch="360"/>
         </w:sectPr>
@@ -1426,6 +1443,2390 @@
         <w:t>https://github.com/ramazanutegen583-pixel/facade-pattern-vault-backup</w:t>
       </w:r>
     </w:p>
+    <w:p>
+      <w:r>
+        <w:br w:type="page"/>
+      </w:r>
+    </w:p>
+    <w:p>
+      <w:pPr>
+        <w:pStyle w:val="Heading1"/>
+      </w:pPr>
+      <w:r>
+        <w:t>Appendix A Source declarations and local variables</w:t>
+      </w:r>
+    </w:p>
+    <w:p>
+      <w:r>
+        <w:t>The counts below were extracted from all Java files under src using the JDK compiler tree API. The application has 8 classes; its separate JUnit test adds one class. The main pattern creates one facade and six device objects. HomeTheaterDemo has a static entry point and is not instantiated. Local variables have method scope and are not UML class attributes.</w:t>
+      </w:r>
+    </w:p>
+    <w:tbl>
+      <w:tblPr>
+        <w:tblW w:type="auto" w:w="0"/>
+        <w:jc w:val="center"/>
+        <w:tblLayout w:type="fixed"/>
+        <w:tblLook w:firstColumn="1" w:firstRow="1" w:lastColumn="0" w:lastRow="0" w:noHBand="0" w:noVBand="1" w:val="04A0"/>
+        <w:tblBorders>
+          <w:top w:val="single" w:sz="5" w:color="D9D9D9"/>
+          <w:left w:val="single" w:sz="5" w:color="D9D9D9"/>
+          <w:bottom w:val="single" w:sz="5" w:color="D9D9D9"/>
+          <w:right w:val="single" w:sz="5" w:color="D9D9D9"/>
+          <w:insideH w:val="single" w:sz="5" w:color="D9D9D9"/>
+          <w:insideV w:val="single" w:sz="5" w:color="D9D9D9"/>
+        </w:tblBorders>
+      </w:tblPr>
+      <w:tblGrid>
+        <w:gridCol w:w="3744"/>
+        <w:gridCol w:w="1152"/>
+        <w:gridCol w:w="1296"/>
+        <w:gridCol w:w="3528"/>
+      </w:tblGrid>
+      <w:tr>
+        <w:trPr>
+          <w:cantSplit/>
+          <w:tblHeader/>
+        </w:trPr>
+        <w:tc>
+          <w:tcPr>
+            <w:tcW w:type="dxa" w:w="3744"/>
+            <w:vAlign w:val="center"/>
+            <w:shd w:fill="233F55"/>
+            <w:tcMar>
+              <w:top w:w="80" w:type="dxa"/>
+              <w:left w:w="80" w:type="dxa"/>
+              <w:bottom w:w="80" w:type="dxa"/>
+              <w:right w:w="80" w:type="dxa"/>
+            </w:tcMar>
+          </w:tcPr>
+          <w:p>
+            <w:pPr>
+              <w:spacing w:after="0" w:line="252" w:lineRule="auto"/>
+            </w:pPr>
+            <w:r>
+              <w:rPr>
+                <w:b/>
+                <w:color w:val="FFFFFF"/>
+                <w:sz w:val="18"/>
+              </w:rPr>
+              <w:t>Class</w:t>
+            </w:r>
+          </w:p>
+        </w:tc>
+        <w:tc>
+          <w:tcPr>
+            <w:tcW w:type="dxa" w:w="1152"/>
+            <w:vAlign w:val="center"/>
+            <w:shd w:fill="233F55"/>
+            <w:tcMar>
+              <w:top w:w="80" w:type="dxa"/>
+              <w:left w:w="80" w:type="dxa"/>
+              <w:bottom w:w="80" w:type="dxa"/>
+              <w:right w:w="80" w:type="dxa"/>
+            </w:tcMar>
+          </w:tcPr>
+          <w:p>
+            <w:pPr>
+              <w:spacing w:after="0" w:line="252" w:lineRule="auto"/>
+            </w:pPr>
+            <w:r>
+              <w:rPr>
+                <w:b/>
+                <w:color w:val="FFFFFF"/>
+                <w:sz w:val="18"/>
+              </w:rPr>
+              <w:t>Fields</w:t>
+            </w:r>
+          </w:p>
+        </w:tc>
+        <w:tc>
+          <w:tcPr>
+            <w:tcW w:type="dxa" w:w="1296"/>
+            <w:vAlign w:val="center"/>
+            <w:shd w:fill="233F55"/>
+            <w:tcMar>
+              <w:top w:w="80" w:type="dxa"/>
+              <w:left w:w="80" w:type="dxa"/>
+              <w:bottom w:w="80" w:type="dxa"/>
+              <w:right w:w="80" w:type="dxa"/>
+            </w:tcMar>
+          </w:tcPr>
+          <w:p>
+            <w:pPr>
+              <w:spacing w:after="0" w:line="252" w:lineRule="auto"/>
+            </w:pPr>
+            <w:r>
+              <w:rPr>
+                <w:b/>
+                <w:color w:val="FFFFFF"/>
+                <w:sz w:val="18"/>
+              </w:rPr>
+              <w:t>Methods</w:t>
+            </w:r>
+          </w:p>
+        </w:tc>
+        <w:tc>
+          <w:tcPr>
+            <w:tcW w:type="dxa" w:w="3528"/>
+            <w:vAlign w:val="center"/>
+            <w:shd w:fill="233F55"/>
+            <w:tcMar>
+              <w:top w:w="80" w:type="dxa"/>
+              <w:left w:w="80" w:type="dxa"/>
+              <w:bottom w:w="80" w:type="dxa"/>
+              <w:right w:w="80" w:type="dxa"/>
+            </w:tcMar>
+          </w:tcPr>
+          <w:p>
+            <w:pPr>
+              <w:spacing w:after="0" w:line="252" w:lineRule="auto"/>
+            </w:pPr>
+            <w:r>
+              <w:rPr>
+                <w:b/>
+                <w:color w:val="FFFFFF"/>
+                <w:sz w:val="18"/>
+              </w:rPr>
+              <w:t>Declared constructors</w:t>
+            </w:r>
+          </w:p>
+        </w:tc>
+      </w:tr>
+      <w:tr>
+        <w:trPr>
+          <w:cantSplit/>
+        </w:trPr>
+        <w:tc>
+          <w:tcPr>
+            <w:tcW w:type="dxa" w:w="3744"/>
+            <w:vAlign w:val="center"/>
+            <w:shd w:fill="FFFFFF"/>
+            <w:tcMar>
+              <w:top w:w="80" w:type="dxa"/>
+              <w:left w:w="80" w:type="dxa"/>
+              <w:bottom w:w="80" w:type="dxa"/>
+              <w:right w:w="80" w:type="dxa"/>
+            </w:tcMar>
+          </w:tcPr>
+          <w:p>
+            <w:pPr>
+              <w:spacing w:after="0" w:line="252" w:lineRule="auto"/>
+            </w:pPr>
+            <w:r>
+              <w:rPr>
+                <w:sz w:val="18"/>
+              </w:rPr>
+              <w:t>HomeTheaterDemo</w:t>
+            </w:r>
+          </w:p>
+        </w:tc>
+        <w:tc>
+          <w:tcPr>
+            <w:tcW w:type="dxa" w:w="1152"/>
+            <w:vAlign w:val="center"/>
+            <w:shd w:fill="FFFFFF"/>
+            <w:tcMar>
+              <w:top w:w="80" w:type="dxa"/>
+              <w:left w:w="80" w:type="dxa"/>
+              <w:bottom w:w="80" w:type="dxa"/>
+              <w:right w:w="80" w:type="dxa"/>
+            </w:tcMar>
+          </w:tcPr>
+          <w:p>
+            <w:pPr>
+              <w:spacing w:after="0" w:line="252" w:lineRule="auto"/>
+            </w:pPr>
+            <w:r>
+              <w:rPr>
+                <w:sz w:val="18"/>
+              </w:rPr>
+              <w:t>0</w:t>
+            </w:r>
+          </w:p>
+        </w:tc>
+        <w:tc>
+          <w:tcPr>
+            <w:tcW w:type="dxa" w:w="1296"/>
+            <w:vAlign w:val="center"/>
+            <w:shd w:fill="FFFFFF"/>
+            <w:tcMar>
+              <w:top w:w="80" w:type="dxa"/>
+              <w:left w:w="80" w:type="dxa"/>
+              <w:bottom w:w="80" w:type="dxa"/>
+              <w:right w:w="80" w:type="dxa"/>
+            </w:tcMar>
+          </w:tcPr>
+          <w:p>
+            <w:pPr>
+              <w:spacing w:after="0" w:line="252" w:lineRule="auto"/>
+            </w:pPr>
+            <w:r>
+              <w:rPr>
+                <w:sz w:val="18"/>
+              </w:rPr>
+              <w:t>1</w:t>
+            </w:r>
+          </w:p>
+        </w:tc>
+        <w:tc>
+          <w:tcPr>
+            <w:tcW w:type="dxa" w:w="3528"/>
+            <w:vAlign w:val="center"/>
+            <w:shd w:fill="FFFFFF"/>
+            <w:tcMar>
+              <w:top w:w="80" w:type="dxa"/>
+              <w:left w:w="80" w:type="dxa"/>
+              <w:bottom w:w="80" w:type="dxa"/>
+              <w:right w:w="80" w:type="dxa"/>
+            </w:tcMar>
+          </w:tcPr>
+          <w:p>
+            <w:pPr>
+              <w:spacing w:after="0" w:line="252" w:lineRule="auto"/>
+            </w:pPr>
+            <w:r>
+              <w:rPr>
+                <w:sz w:val="18"/>
+              </w:rPr>
+              <w:t>1</w:t>
+            </w:r>
+          </w:p>
+        </w:tc>
+      </w:tr>
+      <w:tr>
+        <w:trPr>
+          <w:cantSplit/>
+        </w:trPr>
+        <w:tc>
+          <w:tcPr>
+            <w:tcW w:type="dxa" w:w="3744"/>
+            <w:vAlign w:val="center"/>
+            <w:shd w:fill="F0F4F7"/>
+            <w:tcMar>
+              <w:top w:w="80" w:type="dxa"/>
+              <w:left w:w="80" w:type="dxa"/>
+              <w:bottom w:w="80" w:type="dxa"/>
+              <w:right w:w="80" w:type="dxa"/>
+            </w:tcMar>
+          </w:tcPr>
+          <w:p>
+            <w:pPr>
+              <w:spacing w:after="0" w:line="252" w:lineRule="auto"/>
+            </w:pPr>
+            <w:r>
+              <w:rPr>
+                <w:sz w:val="18"/>
+              </w:rPr>
+              <w:t>HomeTheaterFacade</w:t>
+            </w:r>
+          </w:p>
+        </w:tc>
+        <w:tc>
+          <w:tcPr>
+            <w:tcW w:type="dxa" w:w="1152"/>
+            <w:vAlign w:val="center"/>
+            <w:shd w:fill="F0F4F7"/>
+            <w:tcMar>
+              <w:top w:w="80" w:type="dxa"/>
+              <w:left w:w="80" w:type="dxa"/>
+              <w:bottom w:w="80" w:type="dxa"/>
+              <w:right w:w="80" w:type="dxa"/>
+            </w:tcMar>
+          </w:tcPr>
+          <w:p>
+            <w:pPr>
+              <w:spacing w:after="0" w:line="252" w:lineRule="auto"/>
+            </w:pPr>
+            <w:r>
+              <w:rPr>
+                <w:sz w:val="18"/>
+              </w:rPr>
+              <w:t>8</w:t>
+            </w:r>
+          </w:p>
+        </w:tc>
+        <w:tc>
+          <w:tcPr>
+            <w:tcW w:type="dxa" w:w="1296"/>
+            <w:vAlign w:val="center"/>
+            <w:shd w:fill="F0F4F7"/>
+            <w:tcMar>
+              <w:top w:w="80" w:type="dxa"/>
+              <w:left w:w="80" w:type="dxa"/>
+              <w:bottom w:w="80" w:type="dxa"/>
+              <w:right w:w="80" w:type="dxa"/>
+            </w:tcMar>
+          </w:tcPr>
+          <w:p>
+            <w:pPr>
+              <w:spacing w:after="0" w:line="252" w:lineRule="auto"/>
+            </w:pPr>
+            <w:r>
+              <w:rPr>
+                <w:sz w:val="18"/>
+              </w:rPr>
+              <w:t>6</w:t>
+            </w:r>
+          </w:p>
+        </w:tc>
+        <w:tc>
+          <w:tcPr>
+            <w:tcW w:type="dxa" w:w="3528"/>
+            <w:vAlign w:val="center"/>
+            <w:shd w:fill="F0F4F7"/>
+            <w:tcMar>
+              <w:top w:w="80" w:type="dxa"/>
+              <w:left w:w="80" w:type="dxa"/>
+              <w:bottom w:w="80" w:type="dxa"/>
+              <w:right w:w="80" w:type="dxa"/>
+            </w:tcMar>
+          </w:tcPr>
+          <w:p>
+            <w:pPr>
+              <w:spacing w:after="0" w:line="252" w:lineRule="auto"/>
+            </w:pPr>
+            <w:r>
+              <w:rPr>
+                <w:sz w:val="18"/>
+              </w:rPr>
+              <w:t>0</w:t>
+            </w:r>
+          </w:p>
+        </w:tc>
+      </w:tr>
+      <w:tr>
+        <w:trPr>
+          <w:cantSplit/>
+        </w:trPr>
+        <w:tc>
+          <w:tcPr>
+            <w:tcW w:type="dxa" w:w="3744"/>
+            <w:vAlign w:val="center"/>
+            <w:shd w:fill="FFFFFF"/>
+            <w:tcMar>
+              <w:top w:w="80" w:type="dxa"/>
+              <w:left w:w="80" w:type="dxa"/>
+              <w:bottom w:w="80" w:type="dxa"/>
+              <w:right w:w="80" w:type="dxa"/>
+            </w:tcMar>
+          </w:tcPr>
+          <w:p>
+            <w:pPr>
+              <w:spacing w:after="0" w:line="252" w:lineRule="auto"/>
+            </w:pPr>
+            <w:r>
+              <w:rPr>
+                <w:sz w:val="18"/>
+              </w:rPr>
+              <w:t>Amplifier</w:t>
+            </w:r>
+          </w:p>
+        </w:tc>
+        <w:tc>
+          <w:tcPr>
+            <w:tcW w:type="dxa" w:w="1152"/>
+            <w:vAlign w:val="center"/>
+            <w:shd w:fill="FFFFFF"/>
+            <w:tcMar>
+              <w:top w:w="80" w:type="dxa"/>
+              <w:left w:w="80" w:type="dxa"/>
+              <w:bottom w:w="80" w:type="dxa"/>
+              <w:right w:w="80" w:type="dxa"/>
+            </w:tcMar>
+          </w:tcPr>
+          <w:p>
+            <w:pPr>
+              <w:spacing w:after="0" w:line="252" w:lineRule="auto"/>
+            </w:pPr>
+            <w:r>
+              <w:rPr>
+                <w:sz w:val="18"/>
+              </w:rPr>
+              <w:t>3</w:t>
+            </w:r>
+          </w:p>
+        </w:tc>
+        <w:tc>
+          <w:tcPr>
+            <w:tcW w:type="dxa" w:w="1296"/>
+            <w:vAlign w:val="center"/>
+            <w:shd w:fill="FFFFFF"/>
+            <w:tcMar>
+              <w:top w:w="80" w:type="dxa"/>
+              <w:left w:w="80" w:type="dxa"/>
+              <w:bottom w:w="80" w:type="dxa"/>
+              <w:right w:w="80" w:type="dxa"/>
+            </w:tcMar>
+          </w:tcPr>
+          <w:p>
+            <w:pPr>
+              <w:spacing w:after="0" w:line="252" w:lineRule="auto"/>
+            </w:pPr>
+            <w:r>
+              <w:rPr>
+                <w:sz w:val="18"/>
+              </w:rPr>
+              <w:t>8</w:t>
+            </w:r>
+          </w:p>
+        </w:tc>
+        <w:tc>
+          <w:tcPr>
+            <w:tcW w:type="dxa" w:w="3528"/>
+            <w:vAlign w:val="center"/>
+            <w:shd w:fill="FFFFFF"/>
+            <w:tcMar>
+              <w:top w:w="80" w:type="dxa"/>
+              <w:left w:w="80" w:type="dxa"/>
+              <w:bottom w:w="80" w:type="dxa"/>
+              <w:right w:w="80" w:type="dxa"/>
+            </w:tcMar>
+          </w:tcPr>
+          <w:p>
+            <w:pPr>
+              <w:spacing w:after="0" w:line="252" w:lineRule="auto"/>
+            </w:pPr>
+            <w:r>
+              <w:rPr>
+                <w:sz w:val="18"/>
+              </w:rPr>
+              <w:t>0</w:t>
+            </w:r>
+          </w:p>
+        </w:tc>
+      </w:tr>
+      <w:tr>
+        <w:trPr>
+          <w:cantSplit/>
+        </w:trPr>
+        <w:tc>
+          <w:tcPr>
+            <w:tcW w:type="dxa" w:w="3744"/>
+            <w:vAlign w:val="center"/>
+            <w:shd w:fill="F0F4F7"/>
+            <w:tcMar>
+              <w:top w:w="80" w:type="dxa"/>
+              <w:left w:w="80" w:type="dxa"/>
+              <w:bottom w:w="80" w:type="dxa"/>
+              <w:right w:w="80" w:type="dxa"/>
+            </w:tcMar>
+          </w:tcPr>
+          <w:p>
+            <w:pPr>
+              <w:spacing w:after="0" w:line="252" w:lineRule="auto"/>
+            </w:pPr>
+            <w:r>
+              <w:rPr>
+                <w:sz w:val="18"/>
+              </w:rPr>
+              <w:t>PopcornMaker</w:t>
+            </w:r>
+          </w:p>
+        </w:tc>
+        <w:tc>
+          <w:tcPr>
+            <w:tcW w:type="dxa" w:w="1152"/>
+            <w:vAlign w:val="center"/>
+            <w:shd w:fill="F0F4F7"/>
+            <w:tcMar>
+              <w:top w:w="80" w:type="dxa"/>
+              <w:left w:w="80" w:type="dxa"/>
+              <w:bottom w:w="80" w:type="dxa"/>
+              <w:right w:w="80" w:type="dxa"/>
+            </w:tcMar>
+          </w:tcPr>
+          <w:p>
+            <w:pPr>
+              <w:spacing w:after="0" w:line="252" w:lineRule="auto"/>
+            </w:pPr>
+            <w:r>
+              <w:rPr>
+                <w:sz w:val="18"/>
+              </w:rPr>
+              <w:t>1</w:t>
+            </w:r>
+          </w:p>
+        </w:tc>
+        <w:tc>
+          <w:tcPr>
+            <w:tcW w:type="dxa" w:w="1296"/>
+            <w:vAlign w:val="center"/>
+            <w:shd w:fill="F0F4F7"/>
+            <w:tcMar>
+              <w:top w:w="80" w:type="dxa"/>
+              <w:left w:w="80" w:type="dxa"/>
+              <w:bottom w:w="80" w:type="dxa"/>
+              <w:right w:w="80" w:type="dxa"/>
+            </w:tcMar>
+          </w:tcPr>
+          <w:p>
+            <w:pPr>
+              <w:spacing w:after="0" w:line="252" w:lineRule="auto"/>
+            </w:pPr>
+            <w:r>
+              <w:rPr>
+                <w:sz w:val="18"/>
+              </w:rPr>
+              <w:t>4</w:t>
+            </w:r>
+          </w:p>
+        </w:tc>
+        <w:tc>
+          <w:tcPr>
+            <w:tcW w:type="dxa" w:w="3528"/>
+            <w:vAlign w:val="center"/>
+            <w:shd w:fill="F0F4F7"/>
+            <w:tcMar>
+              <w:top w:w="80" w:type="dxa"/>
+              <w:left w:w="80" w:type="dxa"/>
+              <w:bottom w:w="80" w:type="dxa"/>
+              <w:right w:w="80" w:type="dxa"/>
+            </w:tcMar>
+          </w:tcPr>
+          <w:p>
+            <w:pPr>
+              <w:spacing w:after="0" w:line="252" w:lineRule="auto"/>
+            </w:pPr>
+            <w:r>
+              <w:rPr>
+                <w:sz w:val="18"/>
+              </w:rPr>
+              <w:t>0</w:t>
+            </w:r>
+          </w:p>
+        </w:tc>
+      </w:tr>
+      <w:tr>
+        <w:trPr>
+          <w:cantSplit/>
+        </w:trPr>
+        <w:tc>
+          <w:tcPr>
+            <w:tcW w:type="dxa" w:w="3744"/>
+            <w:vAlign w:val="center"/>
+            <w:shd w:fill="FFFFFF"/>
+            <w:tcMar>
+              <w:top w:w="80" w:type="dxa"/>
+              <w:left w:w="80" w:type="dxa"/>
+              <w:bottom w:w="80" w:type="dxa"/>
+              <w:right w:w="80" w:type="dxa"/>
+            </w:tcMar>
+          </w:tcPr>
+          <w:p>
+            <w:pPr>
+              <w:spacing w:after="0" w:line="252" w:lineRule="auto"/>
+            </w:pPr>
+            <w:r>
+              <w:rPr>
+                <w:sz w:val="18"/>
+              </w:rPr>
+              <w:t>Projector</w:t>
+            </w:r>
+          </w:p>
+        </w:tc>
+        <w:tc>
+          <w:tcPr>
+            <w:tcW w:type="dxa" w:w="1152"/>
+            <w:vAlign w:val="center"/>
+            <w:shd w:fill="FFFFFF"/>
+            <w:tcMar>
+              <w:top w:w="80" w:type="dxa"/>
+              <w:left w:w="80" w:type="dxa"/>
+              <w:bottom w:w="80" w:type="dxa"/>
+              <w:right w:w="80" w:type="dxa"/>
+            </w:tcMar>
+          </w:tcPr>
+          <w:p>
+            <w:pPr>
+              <w:spacing w:after="0" w:line="252" w:lineRule="auto"/>
+            </w:pPr>
+            <w:r>
+              <w:rPr>
+                <w:sz w:val="18"/>
+              </w:rPr>
+              <w:t>2</w:t>
+            </w:r>
+          </w:p>
+        </w:tc>
+        <w:tc>
+          <w:tcPr>
+            <w:tcW w:type="dxa" w:w="1296"/>
+            <w:vAlign w:val="center"/>
+            <w:shd w:fill="FFFFFF"/>
+            <w:tcMar>
+              <w:top w:w="80" w:type="dxa"/>
+              <w:left w:w="80" w:type="dxa"/>
+              <w:bottom w:w="80" w:type="dxa"/>
+              <w:right w:w="80" w:type="dxa"/>
+            </w:tcMar>
+          </w:tcPr>
+          <w:p>
+            <w:pPr>
+              <w:spacing w:after="0" w:line="252" w:lineRule="auto"/>
+            </w:pPr>
+            <w:r>
+              <w:rPr>
+                <w:sz w:val="18"/>
+              </w:rPr>
+              <w:t>5</w:t>
+            </w:r>
+          </w:p>
+        </w:tc>
+        <w:tc>
+          <w:tcPr>
+            <w:tcW w:type="dxa" w:w="3528"/>
+            <w:vAlign w:val="center"/>
+            <w:shd w:fill="FFFFFF"/>
+            <w:tcMar>
+              <w:top w:w="80" w:type="dxa"/>
+              <w:left w:w="80" w:type="dxa"/>
+              <w:bottom w:w="80" w:type="dxa"/>
+              <w:right w:w="80" w:type="dxa"/>
+            </w:tcMar>
+          </w:tcPr>
+          <w:p>
+            <w:pPr>
+              <w:spacing w:after="0" w:line="252" w:lineRule="auto"/>
+            </w:pPr>
+            <w:r>
+              <w:rPr>
+                <w:sz w:val="18"/>
+              </w:rPr>
+              <w:t>0</w:t>
+            </w:r>
+          </w:p>
+        </w:tc>
+      </w:tr>
+      <w:tr>
+        <w:trPr>
+          <w:cantSplit/>
+        </w:trPr>
+        <w:tc>
+          <w:tcPr>
+            <w:tcW w:type="dxa" w:w="3744"/>
+            <w:vAlign w:val="center"/>
+            <w:shd w:fill="F0F4F7"/>
+            <w:tcMar>
+              <w:top w:w="80" w:type="dxa"/>
+              <w:left w:w="80" w:type="dxa"/>
+              <w:bottom w:w="80" w:type="dxa"/>
+              <w:right w:w="80" w:type="dxa"/>
+            </w:tcMar>
+          </w:tcPr>
+          <w:p>
+            <w:pPr>
+              <w:spacing w:after="0" w:line="252" w:lineRule="auto"/>
+            </w:pPr>
+            <w:r>
+              <w:rPr>
+                <w:sz w:val="18"/>
+              </w:rPr>
+              <w:t>Screen</w:t>
+            </w:r>
+          </w:p>
+        </w:tc>
+        <w:tc>
+          <w:tcPr>
+            <w:tcW w:type="dxa" w:w="1152"/>
+            <w:vAlign w:val="center"/>
+            <w:shd w:fill="F0F4F7"/>
+            <w:tcMar>
+              <w:top w:w="80" w:type="dxa"/>
+              <w:left w:w="80" w:type="dxa"/>
+              <w:bottom w:w="80" w:type="dxa"/>
+              <w:right w:w="80" w:type="dxa"/>
+            </w:tcMar>
+          </w:tcPr>
+          <w:p>
+            <w:pPr>
+              <w:spacing w:after="0" w:line="252" w:lineRule="auto"/>
+            </w:pPr>
+            <w:r>
+              <w:rPr>
+                <w:sz w:val="18"/>
+              </w:rPr>
+              <w:t>1</w:t>
+            </w:r>
+          </w:p>
+        </w:tc>
+        <w:tc>
+          <w:tcPr>
+            <w:tcW w:type="dxa" w:w="1296"/>
+            <w:vAlign w:val="center"/>
+            <w:shd w:fill="F0F4F7"/>
+            <w:tcMar>
+              <w:top w:w="80" w:type="dxa"/>
+              <w:left w:w="80" w:type="dxa"/>
+              <w:bottom w:w="80" w:type="dxa"/>
+              <w:right w:w="80" w:type="dxa"/>
+            </w:tcMar>
+          </w:tcPr>
+          <w:p>
+            <w:pPr>
+              <w:spacing w:after="0" w:line="252" w:lineRule="auto"/>
+            </w:pPr>
+            <w:r>
+              <w:rPr>
+                <w:sz w:val="18"/>
+              </w:rPr>
+              <w:t>3</w:t>
+            </w:r>
+          </w:p>
+        </w:tc>
+        <w:tc>
+          <w:tcPr>
+            <w:tcW w:type="dxa" w:w="3528"/>
+            <w:vAlign w:val="center"/>
+            <w:shd w:fill="F0F4F7"/>
+            <w:tcMar>
+              <w:top w:w="80" w:type="dxa"/>
+              <w:left w:w="80" w:type="dxa"/>
+              <w:bottom w:w="80" w:type="dxa"/>
+              <w:right w:w="80" w:type="dxa"/>
+            </w:tcMar>
+          </w:tcPr>
+          <w:p>
+            <w:pPr>
+              <w:spacing w:after="0" w:line="252" w:lineRule="auto"/>
+            </w:pPr>
+            <w:r>
+              <w:rPr>
+                <w:sz w:val="18"/>
+              </w:rPr>
+              <w:t>0</w:t>
+            </w:r>
+          </w:p>
+        </w:tc>
+      </w:tr>
+      <w:tr>
+        <w:trPr>
+          <w:cantSplit/>
+        </w:trPr>
+        <w:tc>
+          <w:tcPr>
+            <w:tcW w:type="dxa" w:w="3744"/>
+            <w:vAlign w:val="center"/>
+            <w:shd w:fill="FFFFFF"/>
+            <w:tcMar>
+              <w:top w:w="80" w:type="dxa"/>
+              <w:left w:w="80" w:type="dxa"/>
+              <w:bottom w:w="80" w:type="dxa"/>
+              <w:right w:w="80" w:type="dxa"/>
+            </w:tcMar>
+          </w:tcPr>
+          <w:p>
+            <w:pPr>
+              <w:spacing w:after="0" w:line="252" w:lineRule="auto"/>
+            </w:pPr>
+            <w:r>
+              <w:rPr>
+                <w:sz w:val="18"/>
+              </w:rPr>
+              <w:t>StreamingPlayer</w:t>
+            </w:r>
+          </w:p>
+        </w:tc>
+        <w:tc>
+          <w:tcPr>
+            <w:tcW w:type="dxa" w:w="1152"/>
+            <w:vAlign w:val="center"/>
+            <w:shd w:fill="FFFFFF"/>
+            <w:tcMar>
+              <w:top w:w="80" w:type="dxa"/>
+              <w:left w:w="80" w:type="dxa"/>
+              <w:bottom w:w="80" w:type="dxa"/>
+              <w:right w:w="80" w:type="dxa"/>
+            </w:tcMar>
+          </w:tcPr>
+          <w:p>
+            <w:pPr>
+              <w:spacing w:after="0" w:line="252" w:lineRule="auto"/>
+            </w:pPr>
+            <w:r>
+              <w:rPr>
+                <w:sz w:val="18"/>
+              </w:rPr>
+              <w:t>3</w:t>
+            </w:r>
+          </w:p>
+        </w:tc>
+        <w:tc>
+          <w:tcPr>
+            <w:tcW w:type="dxa" w:w="1296"/>
+            <w:vAlign w:val="center"/>
+            <w:shd w:fill="FFFFFF"/>
+            <w:tcMar>
+              <w:top w:w="80" w:type="dxa"/>
+              <w:left w:w="80" w:type="dxa"/>
+              <w:bottom w:w="80" w:type="dxa"/>
+              <w:right w:w="80" w:type="dxa"/>
+            </w:tcMar>
+          </w:tcPr>
+          <w:p>
+            <w:pPr>
+              <w:spacing w:after="0" w:line="252" w:lineRule="auto"/>
+            </w:pPr>
+            <w:r>
+              <w:rPr>
+                <w:sz w:val="18"/>
+              </w:rPr>
+              <w:t>10</w:t>
+            </w:r>
+          </w:p>
+        </w:tc>
+        <w:tc>
+          <w:tcPr>
+            <w:tcW w:type="dxa" w:w="3528"/>
+            <w:vAlign w:val="center"/>
+            <w:shd w:fill="FFFFFF"/>
+            <w:tcMar>
+              <w:top w:w="80" w:type="dxa"/>
+              <w:left w:w="80" w:type="dxa"/>
+              <w:bottom w:w="80" w:type="dxa"/>
+              <w:right w:w="80" w:type="dxa"/>
+            </w:tcMar>
+          </w:tcPr>
+          <w:p>
+            <w:pPr>
+              <w:spacing w:after="0" w:line="252" w:lineRule="auto"/>
+            </w:pPr>
+            <w:r>
+              <w:rPr>
+                <w:sz w:val="18"/>
+              </w:rPr>
+              <w:t>0</w:t>
+            </w:r>
+          </w:p>
+        </w:tc>
+      </w:tr>
+      <w:tr>
+        <w:trPr>
+          <w:cantSplit/>
+        </w:trPr>
+        <w:tc>
+          <w:tcPr>
+            <w:tcW w:type="dxa" w:w="3744"/>
+            <w:vAlign w:val="center"/>
+            <w:shd w:fill="F0F4F7"/>
+            <w:tcMar>
+              <w:top w:w="80" w:type="dxa"/>
+              <w:left w:w="80" w:type="dxa"/>
+              <w:bottom w:w="80" w:type="dxa"/>
+              <w:right w:w="80" w:type="dxa"/>
+            </w:tcMar>
+          </w:tcPr>
+          <w:p>
+            <w:pPr>
+              <w:spacing w:after="0" w:line="252" w:lineRule="auto"/>
+            </w:pPr>
+            <w:r>
+              <w:rPr>
+                <w:sz w:val="18"/>
+              </w:rPr>
+              <w:t>TheaterLights</w:t>
+            </w:r>
+          </w:p>
+        </w:tc>
+        <w:tc>
+          <w:tcPr>
+            <w:tcW w:type="dxa" w:w="1152"/>
+            <w:vAlign w:val="center"/>
+            <w:shd w:fill="F0F4F7"/>
+            <w:tcMar>
+              <w:top w:w="80" w:type="dxa"/>
+              <w:left w:w="80" w:type="dxa"/>
+              <w:bottom w:w="80" w:type="dxa"/>
+              <w:right w:w="80" w:type="dxa"/>
+            </w:tcMar>
+          </w:tcPr>
+          <w:p>
+            <w:pPr>
+              <w:spacing w:after="0" w:line="252" w:lineRule="auto"/>
+            </w:pPr>
+            <w:r>
+              <w:rPr>
+                <w:sz w:val="18"/>
+              </w:rPr>
+              <w:t>1</w:t>
+            </w:r>
+          </w:p>
+        </w:tc>
+        <w:tc>
+          <w:tcPr>
+            <w:tcW w:type="dxa" w:w="1296"/>
+            <w:vAlign w:val="center"/>
+            <w:shd w:fill="F0F4F7"/>
+            <w:tcMar>
+              <w:top w:w="80" w:type="dxa"/>
+              <w:left w:w="80" w:type="dxa"/>
+              <w:bottom w:w="80" w:type="dxa"/>
+              <w:right w:w="80" w:type="dxa"/>
+            </w:tcMar>
+          </w:tcPr>
+          <w:p>
+            <w:pPr>
+              <w:spacing w:after="0" w:line="252" w:lineRule="auto"/>
+            </w:pPr>
+            <w:r>
+              <w:rPr>
+                <w:sz w:val="18"/>
+              </w:rPr>
+              <w:t>3</w:t>
+            </w:r>
+          </w:p>
+        </w:tc>
+        <w:tc>
+          <w:tcPr>
+            <w:tcW w:type="dxa" w:w="3528"/>
+            <w:vAlign w:val="center"/>
+            <w:shd w:fill="F0F4F7"/>
+            <w:tcMar>
+              <w:top w:w="80" w:type="dxa"/>
+              <w:left w:w="80" w:type="dxa"/>
+              <w:bottom w:w="80" w:type="dxa"/>
+              <w:right w:w="80" w:type="dxa"/>
+            </w:tcMar>
+          </w:tcPr>
+          <w:p>
+            <w:pPr>
+              <w:spacing w:after="0" w:line="252" w:lineRule="auto"/>
+            </w:pPr>
+            <w:r>
+              <w:rPr>
+                <w:sz w:val="18"/>
+              </w:rPr>
+              <w:t>0</w:t>
+            </w:r>
+          </w:p>
+        </w:tc>
+      </w:tr>
+      <w:tr>
+        <w:trPr>
+          <w:cantSplit/>
+        </w:trPr>
+        <w:tc>
+          <w:tcPr>
+            <w:tcW w:type="dxa" w:w="3744"/>
+            <w:vAlign w:val="center"/>
+            <w:shd w:fill="FFFFFF"/>
+            <w:tcMar>
+              <w:top w:w="80" w:type="dxa"/>
+              <w:left w:w="80" w:type="dxa"/>
+              <w:bottom w:w="80" w:type="dxa"/>
+              <w:right w:w="80" w:type="dxa"/>
+            </w:tcMar>
+          </w:tcPr>
+          <w:p>
+            <w:pPr>
+              <w:spacing w:after="0" w:line="252" w:lineRule="auto"/>
+            </w:pPr>
+            <w:r>
+              <w:rPr>
+                <w:sz w:val="18"/>
+              </w:rPr>
+              <w:t>HomeTheaterTest</w:t>
+            </w:r>
+          </w:p>
+        </w:tc>
+        <w:tc>
+          <w:tcPr>
+            <w:tcW w:type="dxa" w:w="1152"/>
+            <w:vAlign w:val="center"/>
+            <w:shd w:fill="FFFFFF"/>
+            <w:tcMar>
+              <w:top w:w="80" w:type="dxa"/>
+              <w:left w:w="80" w:type="dxa"/>
+              <w:bottom w:w="80" w:type="dxa"/>
+              <w:right w:w="80" w:type="dxa"/>
+            </w:tcMar>
+          </w:tcPr>
+          <w:p>
+            <w:pPr>
+              <w:spacing w:after="0" w:line="252" w:lineRule="auto"/>
+            </w:pPr>
+            <w:r>
+              <w:rPr>
+                <w:sz w:val="18"/>
+              </w:rPr>
+              <w:t>2</w:t>
+            </w:r>
+          </w:p>
+        </w:tc>
+        <w:tc>
+          <w:tcPr>
+            <w:tcW w:type="dxa" w:w="1296"/>
+            <w:vAlign w:val="center"/>
+            <w:shd w:fill="FFFFFF"/>
+            <w:tcMar>
+              <w:top w:w="80" w:type="dxa"/>
+              <w:left w:w="80" w:type="dxa"/>
+              <w:bottom w:w="80" w:type="dxa"/>
+              <w:right w:w="80" w:type="dxa"/>
+            </w:tcMar>
+          </w:tcPr>
+          <w:p>
+            <w:pPr>
+              <w:spacing w:after="0" w:line="252" w:lineRule="auto"/>
+            </w:pPr>
+            <w:r>
+              <w:rPr>
+                <w:sz w:val="18"/>
+              </w:rPr>
+              <w:t>26</w:t>
+            </w:r>
+          </w:p>
+        </w:tc>
+        <w:tc>
+          <w:tcPr>
+            <w:tcW w:type="dxa" w:w="3528"/>
+            <w:vAlign w:val="center"/>
+            <w:shd w:fill="FFFFFF"/>
+            <w:tcMar>
+              <w:top w:w="80" w:type="dxa"/>
+              <w:left w:w="80" w:type="dxa"/>
+              <w:bottom w:w="80" w:type="dxa"/>
+              <w:right w:w="80" w:type="dxa"/>
+            </w:tcMar>
+          </w:tcPr>
+          <w:p>
+            <w:pPr>
+              <w:spacing w:after="0" w:line="252" w:lineRule="auto"/>
+            </w:pPr>
+            <w:r>
+              <w:rPr>
+                <w:sz w:val="18"/>
+              </w:rPr>
+              <w:t>0</w:t>
+            </w:r>
+          </w:p>
+        </w:tc>
+      </w:tr>
+    </w:tbl>
+    <w:p>
+      <w:pPr>
+        <w:spacing w:after="20"/>
+      </w:pPr>
+    </w:p>
+    <w:p>
+      <w:pPr>
+        <w:pStyle w:val="Heading2"/>
+      </w:pPr>
+      <w:r>
+        <w:t>Local variable register</w:t>
+      </w:r>
+    </w:p>
+    <w:p>
+      <w:r>
+        <w:t>All 31 local and lambda parameter declarations are listed below. Method parameters are already included in UML signatures. Explicit var declarations and inferred lambda parameters are identified; line numbers refer to the unchanged Java sources.</w:t>
+      </w:r>
+    </w:p>
+    <w:tbl>
+      <w:tblPr>
+        <w:tblW w:type="auto" w:w="0"/>
+        <w:jc w:val="center"/>
+        <w:tblLayout w:type="fixed"/>
+        <w:tblLook w:firstColumn="1" w:firstRow="1" w:lastColumn="0" w:lastRow="0" w:noHBand="0" w:noVBand="1" w:val="04A0"/>
+        <w:tblBorders>
+          <w:top w:val="single" w:sz="5" w:color="D9D9D9"/>
+          <w:left w:val="single" w:sz="5" w:color="D9D9D9"/>
+          <w:bottom w:val="single" w:sz="5" w:color="D9D9D9"/>
+          <w:right w:val="single" w:sz="5" w:color="D9D9D9"/>
+          <w:insideH w:val="single" w:sz="5" w:color="D9D9D9"/>
+          <w:insideV w:val="single" w:sz="5" w:color="D9D9D9"/>
+        </w:tblBorders>
+      </w:tblPr>
+      <w:tblGrid>
+        <w:gridCol w:w="5976"/>
+        <w:gridCol w:w="3744"/>
+      </w:tblGrid>
+      <w:tr>
+        <w:trPr>
+          <w:cantSplit/>
+          <w:tblHeader/>
+        </w:trPr>
+        <w:tc>
+          <w:tcPr>
+            <w:tcW w:type="dxa" w:w="5976"/>
+            <w:vAlign w:val="center"/>
+            <w:shd w:fill="233F55"/>
+            <w:tcMar>
+              <w:top w:w="80" w:type="dxa"/>
+              <w:left w:w="80" w:type="dxa"/>
+              <w:bottom w:w="80" w:type="dxa"/>
+              <w:right w:w="80" w:type="dxa"/>
+            </w:tcMar>
+          </w:tcPr>
+          <w:p>
+            <w:pPr>
+              <w:spacing w:after="0" w:line="252" w:lineRule="auto"/>
+            </w:pPr>
+            <w:r>
+              <w:rPr>
+                <w:b/>
+                <w:color w:val="FFFFFF"/>
+                <w:sz w:val="18"/>
+              </w:rPr>
+              <w:t>Class and method</w:t>
+            </w:r>
+          </w:p>
+        </w:tc>
+        <w:tc>
+          <w:tcPr>
+            <w:tcW w:type="dxa" w:w="3744"/>
+            <w:vAlign w:val="center"/>
+            <w:shd w:fill="233F55"/>
+            <w:tcMar>
+              <w:top w:w="80" w:type="dxa"/>
+              <w:left w:w="80" w:type="dxa"/>
+              <w:bottom w:w="80" w:type="dxa"/>
+              <w:right w:w="80" w:type="dxa"/>
+            </w:tcMar>
+          </w:tcPr>
+          <w:p>
+            <w:pPr>
+              <w:spacing w:after="0" w:line="252" w:lineRule="auto"/>
+            </w:pPr>
+            <w:r>
+              <w:rPr>
+                <w:b/>
+                <w:color w:val="FFFFFF"/>
+                <w:sz w:val="18"/>
+              </w:rPr>
+              <w:t>Local declarations</w:t>
+            </w:r>
+          </w:p>
+        </w:tc>
+      </w:tr>
+      <w:tr>
+        <w:trPr>
+          <w:cantSplit/>
+        </w:trPr>
+        <w:tc>
+          <w:tcPr>
+            <w:tcW w:type="dxa" w:w="5976"/>
+            <w:vAlign w:val="center"/>
+            <w:shd w:fill="FFFFFF"/>
+            <w:tcMar>
+              <w:top w:w="80" w:type="dxa"/>
+              <w:left w:w="80" w:type="dxa"/>
+              <w:bottom w:w="80" w:type="dxa"/>
+              <w:right w:w="80" w:type="dxa"/>
+            </w:tcMar>
+          </w:tcPr>
+          <w:p>
+            <w:pPr>
+              <w:spacing w:after="0" w:line="252" w:lineRule="auto"/>
+            </w:pPr>
+            <w:r>
+              <w:rPr>
+                <w:sz w:val="18"/>
+              </w:rPr>
+              <w:t>HomeTheaterDemo.main</w:t>
+            </w:r>
+          </w:p>
+        </w:tc>
+        <w:tc>
+          <w:tcPr>
+            <w:tcW w:type="dxa" w:w="3744"/>
+            <w:vAlign w:val="center"/>
+            <w:shd w:fill="FFFFFF"/>
+            <w:tcMar>
+              <w:top w:w="80" w:type="dxa"/>
+              <w:left w:w="80" w:type="dxa"/>
+              <w:bottom w:w="80" w:type="dxa"/>
+              <w:right w:w="80" w:type="dxa"/>
+            </w:tcMar>
+          </w:tcPr>
+          <w:p>
+            <w:pPr>
+              <w:spacing w:after="0" w:line="252" w:lineRule="auto"/>
+            </w:pPr>
+            <w:r>
+              <w:rPr>
+                <w:sz w:val="18"/>
+              </w:rPr>
+              <w:t>theater: HomeTheaterFacade (L10)</w:t>
+            </w:r>
+          </w:p>
+        </w:tc>
+      </w:tr>
+      <w:tr>
+        <w:trPr>
+          <w:cantSplit/>
+        </w:trPr>
+        <w:tc>
+          <w:tcPr>
+            <w:tcW w:type="dxa" w:w="5976"/>
+            <w:vAlign w:val="center"/>
+            <w:shd w:fill="F0F4F7"/>
+            <w:tcMar>
+              <w:top w:w="80" w:type="dxa"/>
+              <w:left w:w="80" w:type="dxa"/>
+              <w:bottom w:w="80" w:type="dxa"/>
+              <w:right w:w="80" w:type="dxa"/>
+            </w:tcMar>
+          </w:tcPr>
+          <w:p>
+            <w:pPr>
+              <w:spacing w:after="0" w:line="252" w:lineRule="auto"/>
+            </w:pPr>
+            <w:r>
+              <w:rPr>
+                <w:sz w:val="18"/>
+              </w:rPr>
+              <w:t>HomeTheaterFacade.watchMovie</w:t>
+            </w:r>
+          </w:p>
+        </w:tc>
+        <w:tc>
+          <w:tcPr>
+            <w:tcW w:type="dxa" w:w="3744"/>
+            <w:vAlign w:val="center"/>
+            <w:shd w:fill="F0F4F7"/>
+            <w:tcMar>
+              <w:top w:w="80" w:type="dxa"/>
+              <w:left w:w="80" w:type="dxa"/>
+              <w:bottom w:w="80" w:type="dxa"/>
+              <w:right w:w="80" w:type="dxa"/>
+            </w:tcMar>
+          </w:tcPr>
+          <w:p>
+            <w:pPr>
+              <w:spacing w:after="0" w:line="252" w:lineRule="auto"/>
+            </w:pPr>
+            <w:r>
+              <w:rPr>
+                <w:sz w:val="18"/>
+              </w:rPr>
+              <w:t>movie: String (L28)</w:t>
+            </w:r>
+          </w:p>
+        </w:tc>
+      </w:tr>
+      <w:tr>
+        <w:trPr>
+          <w:cantSplit/>
+        </w:trPr>
+        <w:tc>
+          <w:tcPr>
+            <w:tcW w:type="dxa" w:w="5976"/>
+            <w:vAlign w:val="center"/>
+            <w:shd w:fill="FFFFFF"/>
+            <w:tcMar>
+              <w:top w:w="80" w:type="dxa"/>
+              <w:left w:w="80" w:type="dxa"/>
+              <w:bottom w:w="80" w:type="dxa"/>
+              <w:right w:w="80" w:type="dxa"/>
+            </w:tcMar>
+          </w:tcPr>
+          <w:p>
+            <w:pPr>
+              <w:spacing w:after="0" w:line="252" w:lineRule="auto"/>
+            </w:pPr>
+            <w:r>
+              <w:rPr>
+                <w:sz w:val="18"/>
+              </w:rPr>
+              <w:t>HomeTheaterTest.completeSessionReturnsToReady</w:t>
+            </w:r>
+          </w:p>
+        </w:tc>
+        <w:tc>
+          <w:tcPr>
+            <w:tcW w:type="dxa" w:w="3744"/>
+            <w:vAlign w:val="center"/>
+            <w:shd w:fill="FFFFFF"/>
+            <w:tcMar>
+              <w:top w:w="80" w:type="dxa"/>
+              <w:left w:w="80" w:type="dxa"/>
+              <w:bottom w:w="80" w:type="dxa"/>
+              <w:right w:w="80" w:type="dxa"/>
+            </w:tcMar>
+          </w:tcPr>
+          <w:p>
+            <w:pPr>
+              <w:spacing w:after="0" w:line="252" w:lineRule="auto"/>
+            </w:pPr>
+            <w:r>
+              <w:rPr>
+                <w:sz w:val="18"/>
+              </w:rPr>
+              <w:t>theater: HomeTheaterFacade (L38)</w:t>
+            </w:r>
+          </w:p>
+        </w:tc>
+      </w:tr>
+      <w:tr>
+        <w:trPr>
+          <w:cantSplit/>
+        </w:trPr>
+        <w:tc>
+          <w:tcPr>
+            <w:tcW w:type="dxa" w:w="5976"/>
+            <w:vAlign w:val="center"/>
+            <w:shd w:fill="F0F4F7"/>
+            <w:tcMar>
+              <w:top w:w="80" w:type="dxa"/>
+              <w:left w:w="80" w:type="dxa"/>
+              <w:bottom w:w="80" w:type="dxa"/>
+              <w:right w:w="80" w:type="dxa"/>
+            </w:tcMar>
+          </w:tcPr>
+          <w:p>
+            <w:pPr>
+              <w:spacing w:after="0" w:line="252" w:lineRule="auto"/>
+            </w:pPr>
+            <w:r>
+              <w:rPr>
+                <w:sz w:val="18"/>
+              </w:rPr>
+              <w:t>HomeTheaterTest.invalidTitleDoesNotActivateDevices</w:t>
+            </w:r>
+          </w:p>
+        </w:tc>
+        <w:tc>
+          <w:tcPr>
+            <w:tcW w:type="dxa" w:w="3744"/>
+            <w:vAlign w:val="center"/>
+            <w:shd w:fill="F0F4F7"/>
+            <w:tcMar>
+              <w:top w:w="80" w:type="dxa"/>
+              <w:left w:w="80" w:type="dxa"/>
+              <w:bottom w:w="80" w:type="dxa"/>
+              <w:right w:w="80" w:type="dxa"/>
+            </w:tcMar>
+          </w:tcPr>
+          <w:p>
+            <w:pPr>
+              <w:spacing w:after="0" w:line="252" w:lineRule="auto"/>
+            </w:pPr>
+            <w:r>
+              <w:rPr>
+                <w:sz w:val="18"/>
+              </w:rPr>
+              <w:t>theater: HomeTheaterFacade (L54)</w:t>
+            </w:r>
+          </w:p>
+        </w:tc>
+      </w:tr>
+      <w:tr>
+        <w:trPr>
+          <w:cantSplit/>
+        </w:trPr>
+        <w:tc>
+          <w:tcPr>
+            <w:tcW w:type="dxa" w:w="5976"/>
+            <w:vAlign w:val="center"/>
+            <w:shd w:fill="FFFFFF"/>
+            <w:tcMar>
+              <w:top w:w="80" w:type="dxa"/>
+              <w:left w:w="80" w:type="dxa"/>
+              <w:bottom w:w="80" w:type="dxa"/>
+              <w:right w:w="80" w:type="dxa"/>
+            </w:tcMar>
+          </w:tcPr>
+          <w:p>
+            <w:pPr>
+              <w:spacing w:after="0" w:line="252" w:lineRule="auto"/>
+            </w:pPr>
+            <w:r>
+              <w:rPr>
+                <w:sz w:val="18"/>
+              </w:rPr>
+              <w:t>HomeTheaterTest.titleIsTrimmed</w:t>
+            </w:r>
+          </w:p>
+        </w:tc>
+        <w:tc>
+          <w:tcPr>
+            <w:tcW w:type="dxa" w:w="3744"/>
+            <w:vAlign w:val="center"/>
+            <w:shd w:fill="FFFFFF"/>
+            <w:tcMar>
+              <w:top w:w="80" w:type="dxa"/>
+              <w:left w:w="80" w:type="dxa"/>
+              <w:bottom w:w="80" w:type="dxa"/>
+              <w:right w:w="80" w:type="dxa"/>
+            </w:tcMar>
+          </w:tcPr>
+          <w:p>
+            <w:pPr>
+              <w:spacing w:after="0" w:line="252" w:lineRule="auto"/>
+            </w:pPr>
+            <w:r>
+              <w:rPr>
+                <w:sz w:val="18"/>
+              </w:rPr>
+              <w:t>theater: HomeTheaterFacade (L62)</w:t>
+            </w:r>
+          </w:p>
+        </w:tc>
+      </w:tr>
+      <w:tr>
+        <w:trPr>
+          <w:cantSplit/>
+        </w:trPr>
+        <w:tc>
+          <w:tcPr>
+            <w:tcW w:type="dxa" w:w="5976"/>
+            <w:vAlign w:val="center"/>
+            <w:shd w:fill="F0F4F7"/>
+            <w:tcMar>
+              <w:top w:w="80" w:type="dxa"/>
+              <w:left w:w="80" w:type="dxa"/>
+              <w:bottom w:w="80" w:type="dxa"/>
+              <w:right w:w="80" w:type="dxa"/>
+            </w:tcMar>
+          </w:tcPr>
+          <w:p>
+            <w:pPr>
+              <w:spacing w:after="0" w:line="252" w:lineRule="auto"/>
+            </w:pPr>
+            <w:r>
+              <w:rPr>
+                <w:sz w:val="18"/>
+              </w:rPr>
+              <w:t>HomeTheaterTest.anotherMovieCannotReplaceAnActiveSession</w:t>
+            </w:r>
+          </w:p>
+        </w:tc>
+        <w:tc>
+          <w:tcPr>
+            <w:tcW w:type="dxa" w:w="3744"/>
+            <w:vAlign w:val="center"/>
+            <w:shd w:fill="F0F4F7"/>
+            <w:tcMar>
+              <w:top w:w="80" w:type="dxa"/>
+              <w:left w:w="80" w:type="dxa"/>
+              <w:bottom w:w="80" w:type="dxa"/>
+              <w:right w:w="80" w:type="dxa"/>
+            </w:tcMar>
+          </w:tcPr>
+          <w:p>
+            <w:pPr>
+              <w:spacing w:after="0" w:line="252" w:lineRule="auto"/>
+            </w:pPr>
+            <w:r>
+              <w:rPr>
+                <w:sz w:val="18"/>
+              </w:rPr>
+              <w:t>theater: HomeTheaterFacade (L69); before: String (L71)</w:t>
+            </w:r>
+          </w:p>
+        </w:tc>
+      </w:tr>
+      <w:tr>
+        <w:trPr>
+          <w:cantSplit/>
+        </w:trPr>
+        <w:tc>
+          <w:tcPr>
+            <w:tcW w:type="dxa" w:w="5976"/>
+            <w:vAlign w:val="center"/>
+            <w:shd w:fill="FFFFFF"/>
+            <w:tcMar>
+              <w:top w:w="80" w:type="dxa"/>
+              <w:left w:w="80" w:type="dxa"/>
+              <w:bottom w:w="80" w:type="dxa"/>
+              <w:right w:w="80" w:type="dxa"/>
+            </w:tcMar>
+          </w:tcPr>
+          <w:p>
+            <w:pPr>
+              <w:spacing w:after="0" w:line="252" w:lineRule="auto"/>
+            </w:pPr>
+            <w:r>
+              <w:rPr>
+                <w:sz w:val="18"/>
+              </w:rPr>
+              <w:t>HomeTheaterTest.idleOperationsAreRejectedWithoutDeviceChanges</w:t>
+            </w:r>
+          </w:p>
+        </w:tc>
+        <w:tc>
+          <w:tcPr>
+            <w:tcW w:type="dxa" w:w="3744"/>
+            <w:vAlign w:val="center"/>
+            <w:shd w:fill="FFFFFF"/>
+            <w:tcMar>
+              <w:top w:w="80" w:type="dxa"/>
+              <w:left w:w="80" w:type="dxa"/>
+              <w:bottom w:w="80" w:type="dxa"/>
+              <w:right w:w="80" w:type="dxa"/>
+            </w:tcMar>
+          </w:tcPr>
+          <w:p>
+            <w:pPr>
+              <w:spacing w:after="0" w:line="252" w:lineRule="auto"/>
+            </w:pPr>
+            <w:r>
+              <w:rPr>
+                <w:sz w:val="18"/>
+              </w:rPr>
+              <w:t>theater: HomeTheaterFacade (L80)</w:t>
+            </w:r>
+          </w:p>
+        </w:tc>
+      </w:tr>
+      <w:tr>
+        <w:trPr>
+          <w:cantSplit/>
+        </w:trPr>
+        <w:tc>
+          <w:tcPr>
+            <w:tcW w:type="dxa" w:w="5976"/>
+            <w:vAlign w:val="center"/>
+            <w:shd w:fill="F0F4F7"/>
+            <w:tcMar>
+              <w:top w:w="80" w:type="dxa"/>
+              <w:left w:w="80" w:type="dxa"/>
+              <w:bottom w:w="80" w:type="dxa"/>
+              <w:right w:w="80" w:type="dxa"/>
+            </w:tcMar>
+          </w:tcPr>
+          <w:p>
+            <w:pPr>
+              <w:spacing w:after="0" w:line="252" w:lineRule="auto"/>
+            </w:pPr>
+            <w:r>
+              <w:rPr>
+                <w:sz w:val="18"/>
+              </w:rPr>
+              <w:t>HomeTheaterTest.duplicatePauseAndPrematureResumePreserveState</w:t>
+            </w:r>
+          </w:p>
+        </w:tc>
+        <w:tc>
+          <w:tcPr>
+            <w:tcW w:type="dxa" w:w="3744"/>
+            <w:vAlign w:val="center"/>
+            <w:shd w:fill="F0F4F7"/>
+            <w:tcMar>
+              <w:top w:w="80" w:type="dxa"/>
+              <w:left w:w="80" w:type="dxa"/>
+              <w:bottom w:w="80" w:type="dxa"/>
+              <w:right w:w="80" w:type="dxa"/>
+            </w:tcMar>
+          </w:tcPr>
+          <w:p>
+            <w:pPr>
+              <w:spacing w:after="0" w:line="252" w:lineRule="auto"/>
+            </w:pPr>
+            <w:r>
+              <w:rPr>
+                <w:sz w:val="18"/>
+              </w:rPr>
+              <w:t>theater: HomeTheaterFacade (L94); before: String (L99)</w:t>
+            </w:r>
+          </w:p>
+        </w:tc>
+      </w:tr>
+      <w:tr>
+        <w:trPr>
+          <w:cantSplit/>
+        </w:trPr>
+        <w:tc>
+          <w:tcPr>
+            <w:tcW w:type="dxa" w:w="5976"/>
+            <w:vAlign w:val="center"/>
+            <w:shd w:fill="FFFFFF"/>
+            <w:tcMar>
+              <w:top w:w="80" w:type="dxa"/>
+              <w:left w:w="80" w:type="dxa"/>
+              <w:bottom w:w="80" w:type="dxa"/>
+              <w:right w:w="80" w:type="dxa"/>
+            </w:tcMar>
+          </w:tcPr>
+          <w:p>
+            <w:pPr>
+              <w:spacing w:after="0" w:line="252" w:lineRule="auto"/>
+            </w:pPr>
+            <w:r>
+              <w:rPr>
+                <w:sz w:val="18"/>
+              </w:rPr>
+              <w:t>HomeTheaterTest.pausedSessionCanEndAndTheSameFacadeCanStartAnother</w:t>
+            </w:r>
+          </w:p>
+        </w:tc>
+        <w:tc>
+          <w:tcPr>
+            <w:tcW w:type="dxa" w:w="3744"/>
+            <w:vAlign w:val="center"/>
+            <w:shd w:fill="FFFFFF"/>
+            <w:tcMar>
+              <w:top w:w="80" w:type="dxa"/>
+              <w:left w:w="80" w:type="dxa"/>
+              <w:bottom w:w="80" w:type="dxa"/>
+              <w:right w:w="80" w:type="dxa"/>
+            </w:tcMar>
+          </w:tcPr>
+          <w:p>
+            <w:pPr>
+              <w:spacing w:after="0" w:line="252" w:lineRule="auto"/>
+            </w:pPr>
+            <w:r>
+              <w:rPr>
+                <w:sz w:val="18"/>
+              </w:rPr>
+              <w:t>theater: HomeTheaterFacade (L107)</w:t>
+            </w:r>
+          </w:p>
+        </w:tc>
+      </w:tr>
+      <w:tr>
+        <w:trPr>
+          <w:cantSplit/>
+        </w:trPr>
+        <w:tc>
+          <w:tcPr>
+            <w:tcW w:type="dxa" w:w="5976"/>
+            <w:vAlign w:val="center"/>
+            <w:shd w:fill="F0F4F7"/>
+            <w:tcMar>
+              <w:top w:w="80" w:type="dxa"/>
+              <w:left w:w="80" w:type="dxa"/>
+              <w:bottom w:w="80" w:type="dxa"/>
+              <w:right w:w="80" w:type="dxa"/>
+            </w:tcMar>
+          </w:tcPr>
+          <w:p>
+            <w:pPr>
+              <w:spacing w:after="0" w:line="252" w:lineRule="auto"/>
+            </w:pPr>
+            <w:r>
+              <w:rPr>
+                <w:sz w:val="18"/>
+              </w:rPr>
+              <w:t>HomeTheaterTest.shutdownStopsPlaybackBeforeTurningDevicesOff</w:t>
+            </w:r>
+          </w:p>
+        </w:tc>
+        <w:tc>
+          <w:tcPr>
+            <w:tcW w:type="dxa" w:w="3744"/>
+            <w:vAlign w:val="center"/>
+            <w:shd w:fill="F0F4F7"/>
+            <w:tcMar>
+              <w:top w:w="80" w:type="dxa"/>
+              <w:left w:w="80" w:type="dxa"/>
+              <w:bottom w:w="80" w:type="dxa"/>
+              <w:right w:w="80" w:type="dxa"/>
+            </w:tcMar>
+          </w:tcPr>
+          <w:p>
+            <w:pPr>
+              <w:spacing w:after="0" w:line="252" w:lineRule="auto"/>
+            </w:pPr>
+            <w:r>
+              <w:rPr>
+                <w:sz w:val="18"/>
+              </w:rPr>
+              <w:t>theater: HomeTheaterFacade (L131)</w:t>
+            </w:r>
+          </w:p>
+        </w:tc>
+      </w:tr>
+      <w:tr>
+        <w:trPr>
+          <w:cantSplit/>
+        </w:trPr>
+        <w:tc>
+          <w:tcPr>
+            <w:tcW w:type="dxa" w:w="5976"/>
+            <w:vAlign w:val="center"/>
+            <w:shd w:fill="FFFFFF"/>
+            <w:tcMar>
+              <w:top w:w="80" w:type="dxa"/>
+              <w:left w:w="80" w:type="dxa"/>
+              <w:bottom w:w="80" w:type="dxa"/>
+              <w:right w:w="80" w:type="dxa"/>
+            </w:tcMar>
+          </w:tcPr>
+          <w:p>
+            <w:pPr>
+              <w:spacing w:after="0" w:line="252" w:lineRule="auto"/>
+            </w:pPr>
+            <w:r>
+              <w:rPr>
+                <w:sz w:val="18"/>
+              </w:rPr>
+              <w:t>HomeTheaterTest.pauseAndResumeCoordinateLightingWithPlayback</w:t>
+            </w:r>
+          </w:p>
+        </w:tc>
+        <w:tc>
+          <w:tcPr>
+            <w:tcW w:type="dxa" w:w="3744"/>
+            <w:vAlign w:val="center"/>
+            <w:shd w:fill="FFFFFF"/>
+            <w:tcMar>
+              <w:top w:w="80" w:type="dxa"/>
+              <w:left w:w="80" w:type="dxa"/>
+              <w:bottom w:w="80" w:type="dxa"/>
+              <w:right w:w="80" w:type="dxa"/>
+            </w:tcMar>
+          </w:tcPr>
+          <w:p>
+            <w:pPr>
+              <w:spacing w:after="0" w:line="252" w:lineRule="auto"/>
+            </w:pPr>
+            <w:r>
+              <w:rPr>
+                <w:sz w:val="18"/>
+              </w:rPr>
+              <w:t>theater: HomeTheaterFacade (L143)</w:t>
+            </w:r>
+          </w:p>
+        </w:tc>
+      </w:tr>
+      <w:tr>
+        <w:trPr>
+          <w:cantSplit/>
+        </w:trPr>
+        <w:tc>
+          <w:tcPr>
+            <w:tcW w:type="dxa" w:w="5976"/>
+            <w:vAlign w:val="center"/>
+            <w:shd w:fill="F0F4F7"/>
+            <w:tcMar>
+              <w:top w:w="80" w:type="dxa"/>
+              <w:left w:w="80" w:type="dxa"/>
+              <w:bottom w:w="80" w:type="dxa"/>
+              <w:right w:w="80" w:type="dxa"/>
+            </w:tcMar>
+          </w:tcPr>
+          <w:p>
+            <w:pPr>
+              <w:spacing w:after="0" w:line="252" w:lineRule="auto"/>
+            </w:pPr>
+            <w:r>
+              <w:rPr>
+                <w:sz w:val="18"/>
+              </w:rPr>
+              <w:t>HomeTheaterTest.amplifierCanBeUsedDirectlyAndResetsOnPowerOff</w:t>
+            </w:r>
+          </w:p>
+        </w:tc>
+        <w:tc>
+          <w:tcPr>
+            <w:tcW w:type="dxa" w:w="3744"/>
+            <w:vAlign w:val="center"/>
+            <w:shd w:fill="F0F4F7"/>
+            <w:tcMar>
+              <w:top w:w="80" w:type="dxa"/>
+              <w:left w:w="80" w:type="dxa"/>
+              <w:bottom w:w="80" w:type="dxa"/>
+              <w:right w:w="80" w:type="dxa"/>
+            </w:tcMar>
+          </w:tcPr>
+          <w:p>
+            <w:pPr>
+              <w:spacing w:after="0" w:line="252" w:lineRule="auto"/>
+            </w:pPr>
+            <w:r>
+              <w:rPr>
+                <w:sz w:val="18"/>
+              </w:rPr>
+              <w:t>amplifier: Amplifier (L165)</w:t>
+            </w:r>
+          </w:p>
+        </w:tc>
+      </w:tr>
+      <w:tr>
+        <w:trPr>
+          <w:cantSplit/>
+        </w:trPr>
+        <w:tc>
+          <w:tcPr>
+            <w:tcW w:type="dxa" w:w="5976"/>
+            <w:vAlign w:val="center"/>
+            <w:shd w:fill="FFFFFF"/>
+            <w:tcMar>
+              <w:top w:w="80" w:type="dxa"/>
+              <w:left w:w="80" w:type="dxa"/>
+              <w:bottom w:w="80" w:type="dxa"/>
+              <w:right w:w="80" w:type="dxa"/>
+            </w:tcMar>
+          </w:tcPr>
+          <w:p>
+            <w:pPr>
+              <w:spacing w:after="0" w:line="252" w:lineRule="auto"/>
+            </w:pPr>
+            <w:r>
+              <w:rPr>
+                <w:sz w:val="18"/>
+              </w:rPr>
+              <w:t>HomeTheaterTest.invalidVolumeDoesNotChangeThePreviousSetting</w:t>
+            </w:r>
+          </w:p>
+        </w:tc>
+        <w:tc>
+          <w:tcPr>
+            <w:tcW w:type="dxa" w:w="3744"/>
+            <w:vAlign w:val="center"/>
+            <w:shd w:fill="FFFFFF"/>
+            <w:tcMar>
+              <w:top w:w="80" w:type="dxa"/>
+              <w:left w:w="80" w:type="dxa"/>
+              <w:bottom w:w="80" w:type="dxa"/>
+              <w:right w:w="80" w:type="dxa"/>
+            </w:tcMar>
+          </w:tcPr>
+          <w:p>
+            <w:pPr>
+              <w:spacing w:after="0" w:line="252" w:lineRule="auto"/>
+            </w:pPr>
+            <w:r>
+              <w:rPr>
+                <w:sz w:val="18"/>
+              </w:rPr>
+              <w:t>amplifier: Amplifier (L183)</w:t>
+            </w:r>
+          </w:p>
+        </w:tc>
+      </w:tr>
+      <w:tr>
+        <w:trPr>
+          <w:cantSplit/>
+        </w:trPr>
+        <w:tc>
+          <w:tcPr>
+            <w:tcW w:type="dxa" w:w="5976"/>
+            <w:vAlign w:val="center"/>
+            <w:shd w:fill="F0F4F7"/>
+            <w:tcMar>
+              <w:top w:w="80" w:type="dxa"/>
+              <w:left w:w="80" w:type="dxa"/>
+              <w:bottom w:w="80" w:type="dxa"/>
+              <w:right w:w="80" w:type="dxa"/>
+            </w:tcMar>
+          </w:tcPr>
+          <w:p>
+            <w:pPr>
+              <w:spacing w:after="0" w:line="252" w:lineRule="auto"/>
+            </w:pPr>
+            <w:r>
+              <w:rPr>
+                <w:sz w:val="18"/>
+              </w:rPr>
+              <w:t>HomeTheaterTest.lightsAcceptBoundaryValuesAndRestoreFullLighting</w:t>
+            </w:r>
+          </w:p>
+        </w:tc>
+        <w:tc>
+          <w:tcPr>
+            <w:tcW w:type="dxa" w:w="3744"/>
+            <w:vAlign w:val="center"/>
+            <w:shd w:fill="F0F4F7"/>
+            <w:tcMar>
+              <w:top w:w="80" w:type="dxa"/>
+              <w:left w:w="80" w:type="dxa"/>
+              <w:bottom w:w="80" w:type="dxa"/>
+              <w:right w:w="80" w:type="dxa"/>
+            </w:tcMar>
+          </w:tcPr>
+          <w:p>
+            <w:pPr>
+              <w:spacing w:after="0" w:line="252" w:lineRule="auto"/>
+            </w:pPr>
+            <w:r>
+              <w:rPr>
+                <w:sz w:val="18"/>
+              </w:rPr>
+              <w:t>lights: TheaterLights (L193)</w:t>
+            </w:r>
+          </w:p>
+        </w:tc>
+      </w:tr>
+      <w:tr>
+        <w:trPr>
+          <w:cantSplit/>
+        </w:trPr>
+        <w:tc>
+          <w:tcPr>
+            <w:tcW w:type="dxa" w:w="5976"/>
+            <w:vAlign w:val="center"/>
+            <w:shd w:fill="FFFFFF"/>
+            <w:tcMar>
+              <w:top w:w="80" w:type="dxa"/>
+              <w:left w:w="80" w:type="dxa"/>
+              <w:bottom w:w="80" w:type="dxa"/>
+              <w:right w:w="80" w:type="dxa"/>
+            </w:tcMar>
+          </w:tcPr>
+          <w:p>
+            <w:pPr>
+              <w:spacing w:after="0" w:line="252" w:lineRule="auto"/>
+            </w:pPr>
+            <w:r>
+              <w:rPr>
+                <w:sz w:val="18"/>
+              </w:rPr>
+              <w:t>HomeTheaterTest.invalidBrightnessPreservesThePreviousSetting</w:t>
+            </w:r>
+          </w:p>
+        </w:tc>
+        <w:tc>
+          <w:tcPr>
+            <w:tcW w:type="dxa" w:w="3744"/>
+            <w:vAlign w:val="center"/>
+            <w:shd w:fill="FFFFFF"/>
+            <w:tcMar>
+              <w:top w:w="80" w:type="dxa"/>
+              <w:left w:w="80" w:type="dxa"/>
+              <w:bottom w:w="80" w:type="dxa"/>
+              <w:right w:w="80" w:type="dxa"/>
+            </w:tcMar>
+          </w:tcPr>
+          <w:p>
+            <w:pPr>
+              <w:spacing w:after="0" w:line="252" w:lineRule="auto"/>
+            </w:pPr>
+            <w:r>
+              <w:rPr>
+                <w:sz w:val="18"/>
+              </w:rPr>
+              <w:t>lights: TheaterLights (L203)</w:t>
+            </w:r>
+          </w:p>
+        </w:tc>
+      </w:tr>
+      <w:tr>
+        <w:trPr>
+          <w:cantSplit/>
+        </w:trPr>
+        <w:tc>
+          <w:tcPr>
+            <w:tcW w:type="dxa" w:w="5976"/>
+            <w:vAlign w:val="center"/>
+            <w:shd w:fill="F0F4F7"/>
+            <w:tcMar>
+              <w:top w:w="80" w:type="dxa"/>
+              <w:left w:w="80" w:type="dxa"/>
+              <w:bottom w:w="80" w:type="dxa"/>
+              <w:right w:w="80" w:type="dxa"/>
+            </w:tcMar>
+          </w:tcPr>
+          <w:p>
+            <w:pPr>
+              <w:spacing w:after="0" w:line="252" w:lineRule="auto"/>
+            </w:pPr>
+            <w:r>
+              <w:rPr>
+                <w:sz w:val="18"/>
+              </w:rPr>
+              <w:t>HomeTheaterTest.projectorEnforcesPowerAndResetsItsDisplayMode</w:t>
+            </w:r>
+          </w:p>
+        </w:tc>
+        <w:tc>
+          <w:tcPr>
+            <w:tcW w:type="dxa" w:w="3744"/>
+            <w:vAlign w:val="center"/>
+            <w:shd w:fill="F0F4F7"/>
+            <w:tcMar>
+              <w:top w:w="80" w:type="dxa"/>
+              <w:left w:w="80" w:type="dxa"/>
+              <w:bottom w:w="80" w:type="dxa"/>
+              <w:right w:w="80" w:type="dxa"/>
+            </w:tcMar>
+          </w:tcPr>
+          <w:p>
+            <w:pPr>
+              <w:spacing w:after="0" w:line="252" w:lineRule="auto"/>
+            </w:pPr>
+            <w:r>
+              <w:rPr>
+                <w:sz w:val="18"/>
+              </w:rPr>
+              <w:t>projector: Projector (L210)</w:t>
+            </w:r>
+          </w:p>
+        </w:tc>
+      </w:tr>
+      <w:tr>
+        <w:trPr>
+          <w:cantSplit/>
+        </w:trPr>
+        <w:tc>
+          <w:tcPr>
+            <w:tcW w:type="dxa" w:w="5976"/>
+            <w:vAlign w:val="center"/>
+            <w:shd w:fill="FFFFFF"/>
+            <w:tcMar>
+              <w:top w:w="80" w:type="dxa"/>
+              <w:left w:w="80" w:type="dxa"/>
+              <w:bottom w:w="80" w:type="dxa"/>
+              <w:right w:w="80" w:type="dxa"/>
+            </w:tcMar>
+          </w:tcPr>
+          <w:p>
+            <w:pPr>
+              <w:spacing w:after="0" w:line="252" w:lineRule="auto"/>
+            </w:pPr>
+            <w:r>
+              <w:rPr>
+                <w:sz w:val="18"/>
+              </w:rPr>
+              <w:t>HomeTheaterTest.screenCanBeControlledDirectly</w:t>
+            </w:r>
+          </w:p>
+        </w:tc>
+        <w:tc>
+          <w:tcPr>
+            <w:tcW w:type="dxa" w:w="3744"/>
+            <w:vAlign w:val="center"/>
+            <w:shd w:fill="FFFFFF"/>
+            <w:tcMar>
+              <w:top w:w="80" w:type="dxa"/>
+              <w:left w:w="80" w:type="dxa"/>
+              <w:bottom w:w="80" w:type="dxa"/>
+              <w:right w:w="80" w:type="dxa"/>
+            </w:tcMar>
+          </w:tcPr>
+          <w:p>
+            <w:pPr>
+              <w:spacing w:after="0" w:line="252" w:lineRule="auto"/>
+            </w:pPr>
+            <w:r>
+              <w:rPr>
+                <w:sz w:val="18"/>
+              </w:rPr>
+              <w:t>screen: Screen (L223)</w:t>
+            </w:r>
+          </w:p>
+        </w:tc>
+      </w:tr>
+      <w:tr>
+        <w:trPr>
+          <w:cantSplit/>
+        </w:trPr>
+        <w:tc>
+          <w:tcPr>
+            <w:tcW w:type="dxa" w:w="5976"/>
+            <w:vAlign w:val="center"/>
+            <w:shd w:fill="F0F4F7"/>
+            <w:tcMar>
+              <w:top w:w="80" w:type="dxa"/>
+              <w:left w:w="80" w:type="dxa"/>
+              <w:bottom w:w="80" w:type="dxa"/>
+              <w:right w:w="80" w:type="dxa"/>
+            </w:tcMar>
+          </w:tcPr>
+          <w:p>
+            <w:pPr>
+              <w:spacing w:after="0" w:line="252" w:lineRule="auto"/>
+            </w:pPr>
+            <w:r>
+              <w:rPr>
+                <w:sz w:val="18"/>
+              </w:rPr>
+              <w:t>HomeTheaterTest.popcornMakerRequiresPower</w:t>
+            </w:r>
+          </w:p>
+        </w:tc>
+        <w:tc>
+          <w:tcPr>
+            <w:tcW w:type="dxa" w:w="3744"/>
+            <w:vAlign w:val="center"/>
+            <w:shd w:fill="F0F4F7"/>
+            <w:tcMar>
+              <w:top w:w="80" w:type="dxa"/>
+              <w:left w:w="80" w:type="dxa"/>
+              <w:bottom w:w="80" w:type="dxa"/>
+              <w:right w:w="80" w:type="dxa"/>
+            </w:tcMar>
+          </w:tcPr>
+          <w:p>
+            <w:pPr>
+              <w:spacing w:after="0" w:line="252" w:lineRule="auto"/>
+            </w:pPr>
+            <w:r>
+              <w:rPr>
+                <w:sz w:val="18"/>
+              </w:rPr>
+              <w:t>maker: PopcornMaker (L233)</w:t>
+            </w:r>
+          </w:p>
+        </w:tc>
+      </w:tr>
+      <w:tr>
+        <w:trPr>
+          <w:cantSplit/>
+        </w:trPr>
+        <w:tc>
+          <w:tcPr>
+            <w:tcW w:type="dxa" w:w="5976"/>
+            <w:vAlign w:val="center"/>
+            <w:shd w:fill="FFFFFF"/>
+            <w:tcMar>
+              <w:top w:w="80" w:type="dxa"/>
+              <w:left w:w="80" w:type="dxa"/>
+              <w:bottom w:w="80" w:type="dxa"/>
+              <w:right w:w="80" w:type="dxa"/>
+            </w:tcMar>
+          </w:tcPr>
+          <w:p>
+            <w:pPr>
+              <w:spacing w:after="0" w:line="252" w:lineRule="auto"/>
+            </w:pPr>
+            <w:r>
+              <w:rPr>
+                <w:sz w:val="18"/>
+              </w:rPr>
+              <w:t>HomeTheaterTest.playerSupportsItsOwnLifecycleAndRejectsInvalidTransitions</w:t>
+            </w:r>
+          </w:p>
+        </w:tc>
+        <w:tc>
+          <w:tcPr>
+            <w:tcW w:type="dxa" w:w="3744"/>
+            <w:vAlign w:val="center"/>
+            <w:shd w:fill="FFFFFF"/>
+            <w:tcMar>
+              <w:top w:w="80" w:type="dxa"/>
+              <w:left w:w="80" w:type="dxa"/>
+              <w:bottom w:w="80" w:type="dxa"/>
+              <w:right w:w="80" w:type="dxa"/>
+            </w:tcMar>
+          </w:tcPr>
+          <w:p>
+            <w:pPr>
+              <w:spacing w:after="0" w:line="252" w:lineRule="auto"/>
+            </w:pPr>
+            <w:r>
+              <w:rPr>
+                <w:sz w:val="18"/>
+              </w:rPr>
+              <w:t>player: StreamingPlayer (L245)</w:t>
+            </w:r>
+          </w:p>
+        </w:tc>
+      </w:tr>
+      <w:tr>
+        <w:trPr>
+          <w:cantSplit/>
+        </w:trPr>
+        <w:tc>
+          <w:tcPr>
+            <w:tcW w:type="dxa" w:w="5976"/>
+            <w:vAlign w:val="center"/>
+            <w:shd w:fill="F0F4F7"/>
+            <w:tcMar>
+              <w:top w:w="80" w:type="dxa"/>
+              <w:left w:w="80" w:type="dxa"/>
+              <w:bottom w:w="80" w:type="dxa"/>
+              <w:right w:w="80" w:type="dxa"/>
+            </w:tcMar>
+          </w:tcPr>
+          <w:p>
+            <w:pPr>
+              <w:spacing w:after="0" w:line="252" w:lineRule="auto"/>
+            </w:pPr>
+            <w:r>
+              <w:rPr>
+                <w:sz w:val="18"/>
+              </w:rPr>
+              <w:t>HomeTheaterTest.playerRejectsBlankMovieTitles</w:t>
+            </w:r>
+          </w:p>
+        </w:tc>
+        <w:tc>
+          <w:tcPr>
+            <w:tcW w:type="dxa" w:w="3744"/>
+            <w:vAlign w:val="center"/>
+            <w:shd w:fill="F0F4F7"/>
+            <w:tcMar>
+              <w:top w:w="80" w:type="dxa"/>
+              <w:left w:w="80" w:type="dxa"/>
+              <w:bottom w:w="80" w:type="dxa"/>
+              <w:right w:w="80" w:type="dxa"/>
+            </w:tcMar>
+          </w:tcPr>
+          <w:p>
+            <w:pPr>
+              <w:spacing w:after="0" w:line="252" w:lineRule="auto"/>
+            </w:pPr>
+            <w:r>
+              <w:rPr>
+                <w:sz w:val="18"/>
+              </w:rPr>
+              <w:t>player: StreamingPlayer (L272)</w:t>
+            </w:r>
+          </w:p>
+        </w:tc>
+      </w:tr>
+      <w:tr>
+        <w:trPr>
+          <w:cantSplit/>
+        </w:trPr>
+        <w:tc>
+          <w:tcPr>
+            <w:tcW w:type="dxa" w:w="5976"/>
+            <w:vAlign w:val="center"/>
+            <w:shd w:fill="FFFFFF"/>
+            <w:tcMar>
+              <w:top w:w="80" w:type="dxa"/>
+              <w:left w:w="80" w:type="dxa"/>
+              <w:bottom w:w="80" w:type="dxa"/>
+              <w:right w:w="80" w:type="dxa"/>
+            </w:tcMar>
+          </w:tcPr>
+          <w:p>
+            <w:pPr>
+              <w:spacing w:after="0" w:line="252" w:lineRule="auto"/>
+            </w:pPr>
+            <w:r>
+              <w:rPr>
+                <w:sz w:val="18"/>
+              </w:rPr>
+              <w:t>HomeTheaterTest.subsystemSourcesDoNotReferenceTheFacade</w:t>
+            </w:r>
+          </w:p>
+        </w:tc>
+        <w:tc>
+          <w:tcPr>
+            <w:tcW w:type="dxa" w:w="3744"/>
+            <w:vAlign w:val="center"/>
+            <w:shd w:fill="FFFFFF"/>
+            <w:tcMar>
+              <w:top w:w="80" w:type="dxa"/>
+              <w:left w:w="80" w:type="dxa"/>
+              <w:bottom w:w="80" w:type="dxa"/>
+              <w:right w:w="80" w:type="dxa"/>
+            </w:tcMar>
+          </w:tcPr>
+          <w:p>
+            <w:pPr>
+              <w:spacing w:after="0" w:line="252" w:lineRule="auto"/>
+            </w:pPr>
+            <w:r>
+              <w:rPr>
+                <w:sz w:val="18"/>
+              </w:rPr>
+              <w:t>files: var (L280); source: Path (L281); path: inferred (L281); code: String (L282)</w:t>
+            </w:r>
+          </w:p>
+        </w:tc>
+      </w:tr>
+      <w:tr>
+        <w:trPr>
+          <w:cantSplit/>
+        </w:trPr>
+        <w:tc>
+          <w:tcPr>
+            <w:tcW w:type="dxa" w:w="5976"/>
+            <w:vAlign w:val="center"/>
+            <w:shd w:fill="F0F4F7"/>
+            <w:tcMar>
+              <w:top w:w="80" w:type="dxa"/>
+              <w:left w:w="80" w:type="dxa"/>
+              <w:bottom w:w="80" w:type="dxa"/>
+              <w:right w:w="80" w:type="dxa"/>
+            </w:tcMar>
+          </w:tcPr>
+          <w:p>
+            <w:pPr>
+              <w:spacing w:after="0" w:line="252" w:lineRule="auto"/>
+            </w:pPr>
+            <w:r>
+              <w:rPr>
+                <w:sz w:val="18"/>
+              </w:rPr>
+              <w:t>HomeTheaterTest.clientDoesNotImportOrConstructDevices</w:t>
+            </w:r>
+          </w:p>
+        </w:tc>
+        <w:tc>
+          <w:tcPr>
+            <w:tcW w:type="dxa" w:w="3744"/>
+            <w:vAlign w:val="center"/>
+            <w:shd w:fill="F0F4F7"/>
+            <w:tcMar>
+              <w:top w:w="80" w:type="dxa"/>
+              <w:left w:w="80" w:type="dxa"/>
+              <w:bottom w:w="80" w:type="dxa"/>
+              <w:right w:w="80" w:type="dxa"/>
+            </w:tcMar>
+          </w:tcPr>
+          <w:p>
+            <w:pPr>
+              <w:spacing w:after="0" w:line="252" w:lineRule="auto"/>
+            </w:pPr>
+            <w:r>
+              <w:rPr>
+                <w:sz w:val="18"/>
+              </w:rPr>
+              <w:t>client: String (L291); type: String (L295)</w:t>
+            </w:r>
+          </w:p>
+        </w:tc>
+      </w:tr>
+      <w:tr>
+        <w:trPr>
+          <w:cantSplit/>
+        </w:trPr>
+        <w:tc>
+          <w:tcPr>
+            <w:tcW w:type="dxa" w:w="5976"/>
+            <w:vAlign w:val="center"/>
+            <w:shd w:fill="FFFFFF"/>
+            <w:tcMar>
+              <w:top w:w="80" w:type="dxa"/>
+              <w:left w:w="80" w:type="dxa"/>
+              <w:bottom w:w="80" w:type="dxa"/>
+              <w:right w:w="80" w:type="dxa"/>
+            </w:tcMar>
+          </w:tcPr>
+          <w:p>
+            <w:pPr>
+              <w:spacing w:after="0" w:line="252" w:lineRule="auto"/>
+            </w:pPr>
+            <w:r>
+              <w:rPr>
+                <w:sz w:val="18"/>
+              </w:rPr>
+              <w:t>HomeTheaterTest.assertOrdered</w:t>
+            </w:r>
+          </w:p>
+        </w:tc>
+        <w:tc>
+          <w:tcPr>
+            <w:tcW w:type="dxa" w:w="3744"/>
+            <w:vAlign w:val="center"/>
+            <w:shd w:fill="FFFFFF"/>
+            <w:tcMar>
+              <w:top w:w="80" w:type="dxa"/>
+              <w:left w:w="80" w:type="dxa"/>
+              <w:bottom w:w="80" w:type="dxa"/>
+              <w:right w:w="80" w:type="dxa"/>
+            </w:tcMar>
+          </w:tcPr>
+          <w:p>
+            <w:pPr>
+              <w:spacing w:after="0" w:line="252" w:lineRule="auto"/>
+            </w:pPr>
+            <w:r>
+              <w:rPr>
+                <w:sz w:val="18"/>
+              </w:rPr>
+              <w:t>previous: int (L303); message: String (L304); position: int (L305)</w:t>
+            </w:r>
+          </w:p>
+        </w:tc>
+      </w:tr>
+    </w:tbl>
+    <w:p>
+      <w:pPr>
+        <w:spacing w:after="20"/>
+      </w:pPr>
+    </w:p>
+    <w:p>
+      <w:r>
+        <w:t>Full field initializers, annotations, parameter names, local scopes, source paths, and SHA-256 hashes are included in docs/code-inventory.json. The editable UML is docs/class-diagram.puml. docs/uml-inventory.md provides the complete textual member register.</w:t>
+      </w:r>
+    </w:p>
     <w:sectPr>
       <w:pgSz w:w="11909" w:h="16834"/>
       <w:pgMar w:top="1008" w:right="1080" w:bottom="1008" w:left="1080" w:header="720" w:footer="720" w:gutter="0"/>

</xml_diff>